<commit_message>
add labs and assigments
</commit_message>
<xml_diff>
--- a/Assignment-03/Assignment3-WCIllustration.docx
+++ b/Assignment-03/Assignment3-WCIllustration.docx
@@ -766,13 +766,37 @@
           <w:sz w:val="24"/>
           <w:szCs w:val="24"/>
         </w:rPr>
-        <w:t xml:space="preserve"> 9 + 6 = 15</w:t>
+        <w:t xml:space="preserve"> 9 + </w:t>
+      </w:r>
+      <w:r>
+        <w:rPr>
+          <w:rFonts w:ascii="Segoe UI" w:hAnsi="Segoe UI" w:cs="Segoe UI"/>
+          <w:sz w:val="24"/>
+          <w:szCs w:val="24"/>
+        </w:rPr>
+        <w:t>7</w:t>
+      </w:r>
+      <w:r>
+        <w:rPr>
+          <w:rFonts w:ascii="Segoe UI" w:hAnsi="Segoe UI" w:cs="Segoe UI"/>
+          <w:sz w:val="24"/>
+          <w:szCs w:val="24"/>
+        </w:rPr>
+        <w:t xml:space="preserve"> = 1</w:t>
+      </w:r>
+      <w:r>
+        <w:rPr>
+          <w:rFonts w:ascii="Segoe UI" w:hAnsi="Segoe UI" w:cs="Segoe UI"/>
+          <w:sz w:val="24"/>
+          <w:szCs w:val="24"/>
+        </w:rPr>
+        <w:t>6</w:t>
       </w:r>
     </w:p>
     <w:p>
       <w:pPr>
         <w:spacing w:after="0" w:line="240" w:lineRule="auto"/>
-        <w:ind w:left="270"/>
+        <w:ind w:left="540" w:firstLine="450"/>
         <w:rPr>
           <w:rFonts w:ascii="Segoe UI" w:hAnsi="Segoe UI" w:cs="Segoe UI"/>
           <w:i/>
@@ -780,6 +804,98 @@
           <w:szCs w:val="24"/>
         </w:rPr>
       </w:pPr>
+      <w:r>
+        <w:rPr>
+          <w:rFonts w:ascii="Segoe UI" w:hAnsi="Segoe UI" w:cs="Segoe UI"/>
+          <w:i/>
+          <w:sz w:val="24"/>
+          <w:szCs w:val="24"/>
+        </w:rPr>
+        <w:t>Total number of tokens (key-value pairs) from Machine 2: 9</w:t>
+      </w:r>
+    </w:p>
+    <w:p>
+      <w:pPr>
+        <w:spacing w:after="0" w:line="240" w:lineRule="auto"/>
+        <w:ind w:left="270"/>
+        <w:rPr>
+          <w:rFonts w:ascii="Segoe UI" w:hAnsi="Segoe UI" w:cs="Segoe UI"/>
+          <w:i/>
+          <w:sz w:val="24"/>
+          <w:szCs w:val="24"/>
+        </w:rPr>
+      </w:pPr>
+      <w:r>
+        <w:rPr>
+          <w:rFonts w:ascii="Segoe UI" w:hAnsi="Segoe UI" w:cs="Segoe UI"/>
+          <w:i/>
+          <w:sz w:val="24"/>
+          <w:szCs w:val="24"/>
+        </w:rPr>
+        <w:tab/>
+      </w:r>
+      <w:r>
+        <w:rPr>
+          <w:rFonts w:ascii="Segoe UI" w:hAnsi="Segoe UI" w:cs="Segoe UI"/>
+          <w:i/>
+          <w:sz w:val="24"/>
+          <w:szCs w:val="24"/>
+        </w:rPr>
+        <w:tab/>
+        <w:t>Apple, banana, carrot, cherry, kiwi, mango, pear, plum, rasdish</w:t>
+      </w:r>
+    </w:p>
+    <w:p>
+      <w:pPr>
+        <w:spacing w:after="0" w:line="240" w:lineRule="auto"/>
+        <w:ind w:left="720"/>
+        <w:rPr>
+          <w:rFonts w:ascii="Segoe UI" w:hAnsi="Segoe UI" w:cs="Segoe UI"/>
+          <w:i/>
+          <w:sz w:val="24"/>
+          <w:szCs w:val="24"/>
+        </w:rPr>
+      </w:pPr>
+      <w:r>
+        <w:rPr>
+          <w:rFonts w:ascii="Segoe UI" w:hAnsi="Segoe UI" w:cs="Segoe UI"/>
+          <w:i/>
+          <w:sz w:val="24"/>
+          <w:szCs w:val="24"/>
+        </w:rPr>
+        <w:t xml:space="preserve">    Total number of tokens (key-value pairs) from Machine 3: 7</w:t>
+      </w:r>
+    </w:p>
+    <w:p>
+      <w:pPr>
+        <w:spacing w:after="0" w:line="240" w:lineRule="auto"/>
+        <w:ind w:left="270"/>
+        <w:rPr>
+          <w:rFonts w:ascii="Segoe UI" w:hAnsi="Segoe UI" w:cs="Segoe UI"/>
+          <w:i/>
+          <w:sz w:val="24"/>
+          <w:szCs w:val="24"/>
+        </w:rPr>
+      </w:pPr>
+      <w:r>
+        <w:rPr>
+          <w:rFonts w:ascii="Segoe UI" w:hAnsi="Segoe UI" w:cs="Segoe UI"/>
+          <w:i/>
+          <w:sz w:val="24"/>
+          <w:szCs w:val="24"/>
+        </w:rPr>
+        <w:tab/>
+      </w:r>
+      <w:r>
+        <w:rPr>
+          <w:rFonts w:ascii="Segoe UI" w:hAnsi="Segoe UI" w:cs="Segoe UI"/>
+          <w:i/>
+          <w:sz w:val="24"/>
+          <w:szCs w:val="24"/>
+        </w:rPr>
+        <w:tab/>
+        <w:t>Banana, cherry, kiwi, mango, pear, plum, radish</w:t>
+      </w:r>
     </w:p>
     <w:p>
       <w:pPr>
@@ -2470,25 +2586,7 @@
                 <w:sz w:val="24"/>
                 <w:szCs w:val="24"/>
               </w:rPr>
-              <w:t xml:space="preserve">&lt;banana, </w:t>
-            </w:r>
-            <w:r>
-              <w:rPr>
-                <w:rFonts w:asciiTheme="majorHAnsi" w:hAnsiTheme="majorHAnsi"/>
-                <w:color w:val="0000CC"/>
-                <w:sz w:val="24"/>
-                <w:szCs w:val="24"/>
-              </w:rPr>
-              <w:t>3</w:t>
-            </w:r>
-            <w:r>
-              <w:rPr>
-                <w:rFonts w:asciiTheme="majorHAnsi" w:hAnsiTheme="majorHAnsi"/>
-                <w:color w:val="0000CC"/>
-                <w:sz w:val="24"/>
-                <w:szCs w:val="24"/>
-              </w:rPr>
-              <w:t>&gt;</w:t>
+              <w:t>&lt;banana, 3&gt;</w:t>
             </w:r>
           </w:p>
           <w:p>
@@ -2699,25 +2797,7 @@
                 <w:sz w:val="24"/>
                 <w:szCs w:val="24"/>
               </w:rPr>
-              <w:t>&lt;</w:t>
-            </w:r>
-            <w:r>
-              <w:rPr>
-                <w:rFonts w:asciiTheme="majorHAnsi" w:hAnsiTheme="majorHAnsi"/>
-                <w:color w:val="0000CC"/>
-                <w:sz w:val="24"/>
-                <w:szCs w:val="24"/>
-              </w:rPr>
-              <w:t>pear</w:t>
-            </w:r>
-            <w:r>
-              <w:rPr>
-                <w:rFonts w:asciiTheme="majorHAnsi" w:hAnsiTheme="majorHAnsi"/>
-                <w:color w:val="0000CC"/>
-                <w:sz w:val="24"/>
-                <w:szCs w:val="24"/>
-              </w:rPr>
-              <w:t>, 2&gt;</w:t>
+              <w:t>&lt;pear, 2&gt;</w:t>
             </w:r>
           </w:p>
           <w:p>
@@ -4939,259 +5019,133 @@
                 <w:sz w:val="24"/>
                 <w:szCs w:val="24"/>
               </w:rPr>
-              <w:t xml:space="preserve">&lt;banana, </w:t>
-            </w:r>
-            <w:r>
-              <w:rPr>
-                <w:rFonts w:asciiTheme="majorHAnsi" w:hAnsiTheme="majorHAnsi"/>
-                <w:color w:val="0000CC"/>
-                <w:sz w:val="24"/>
-                <w:szCs w:val="24"/>
-              </w:rPr>
-              <w:t>3</w:t>
-            </w:r>
-            <w:r>
-              <w:rPr>
-                <w:rFonts w:asciiTheme="majorHAnsi" w:hAnsiTheme="majorHAnsi"/>
-                <w:color w:val="0000CC"/>
-                <w:sz w:val="24"/>
-                <w:szCs w:val="24"/>
-              </w:rPr>
-              <w:t>&gt;</w:t>
-            </w:r>
-          </w:p>
-          <w:p>
-            <w:pPr>
-              <w:pStyle w:val="NoSpacing"/>
-              <w:spacing w:line="276" w:lineRule="auto"/>
-              <w:rPr>
-                <w:rFonts w:asciiTheme="majorHAnsi" w:hAnsiTheme="majorHAnsi"/>
-                <w:color w:val="0000CC"/>
-                <w:sz w:val="24"/>
-                <w:szCs w:val="24"/>
-              </w:rPr>
-            </w:pPr>
-            <w:r>
-              <w:rPr>
-                <w:rFonts w:asciiTheme="majorHAnsi" w:hAnsiTheme="majorHAnsi"/>
-                <w:color w:val="0000CC"/>
-                <w:sz w:val="24"/>
-                <w:szCs w:val="24"/>
-              </w:rPr>
-              <w:t xml:space="preserve">&lt;carrot, </w:t>
-            </w:r>
-            <w:r>
-              <w:rPr>
-                <w:rFonts w:asciiTheme="majorHAnsi" w:hAnsiTheme="majorHAnsi"/>
-                <w:color w:val="0000CC"/>
-                <w:sz w:val="24"/>
-                <w:szCs w:val="24"/>
-              </w:rPr>
-              <w:t>1</w:t>
-            </w:r>
-            <w:r>
-              <w:rPr>
-                <w:rFonts w:asciiTheme="majorHAnsi" w:hAnsiTheme="majorHAnsi"/>
-                <w:color w:val="0000CC"/>
-                <w:sz w:val="24"/>
-                <w:szCs w:val="24"/>
-              </w:rPr>
-              <w:t>&gt;</w:t>
-            </w:r>
-          </w:p>
-          <w:p>
-            <w:pPr>
-              <w:pStyle w:val="NoSpacing"/>
-              <w:spacing w:line="276" w:lineRule="auto"/>
-              <w:rPr>
-                <w:rFonts w:asciiTheme="majorHAnsi" w:hAnsiTheme="majorHAnsi"/>
-                <w:color w:val="0000CC"/>
-                <w:sz w:val="24"/>
-                <w:szCs w:val="24"/>
-              </w:rPr>
-            </w:pPr>
-            <w:r>
-              <w:rPr>
-                <w:rFonts w:asciiTheme="majorHAnsi" w:hAnsiTheme="majorHAnsi"/>
-                <w:color w:val="0000CC"/>
-                <w:sz w:val="24"/>
-                <w:szCs w:val="24"/>
-              </w:rPr>
-              <w:t xml:space="preserve">&lt;cherry, </w:t>
-            </w:r>
-            <w:r>
-              <w:rPr>
-                <w:rFonts w:asciiTheme="majorHAnsi" w:hAnsiTheme="majorHAnsi"/>
-                <w:color w:val="0000CC"/>
-                <w:sz w:val="24"/>
-                <w:szCs w:val="24"/>
-              </w:rPr>
-              <w:t>6</w:t>
-            </w:r>
-            <w:r>
-              <w:rPr>
-                <w:rFonts w:asciiTheme="majorHAnsi" w:hAnsiTheme="majorHAnsi"/>
-                <w:color w:val="0000CC"/>
-                <w:sz w:val="24"/>
-                <w:szCs w:val="24"/>
-              </w:rPr>
-              <w:t>&gt;</w:t>
-            </w:r>
-          </w:p>
-          <w:p>
-            <w:pPr>
-              <w:pStyle w:val="NoSpacing"/>
-              <w:spacing w:line="276" w:lineRule="auto"/>
-              <w:rPr>
-                <w:rFonts w:asciiTheme="majorHAnsi" w:hAnsiTheme="majorHAnsi"/>
-                <w:color w:val="0000CC"/>
-                <w:sz w:val="24"/>
-                <w:szCs w:val="24"/>
-              </w:rPr>
-            </w:pPr>
-            <w:r>
-              <w:rPr>
-                <w:rFonts w:asciiTheme="majorHAnsi" w:hAnsiTheme="majorHAnsi"/>
-                <w:color w:val="0000CC"/>
-                <w:sz w:val="24"/>
-                <w:szCs w:val="24"/>
-              </w:rPr>
-              <w:t xml:space="preserve">&lt;mango, </w:t>
-            </w:r>
-            <w:r>
-              <w:rPr>
-                <w:rFonts w:asciiTheme="majorHAnsi" w:hAnsiTheme="majorHAnsi"/>
-                <w:color w:val="0000CC"/>
-                <w:sz w:val="24"/>
-                <w:szCs w:val="24"/>
-              </w:rPr>
-              <w:t>2</w:t>
-            </w:r>
-            <w:r>
-              <w:rPr>
-                <w:rFonts w:asciiTheme="majorHAnsi" w:hAnsiTheme="majorHAnsi"/>
-                <w:color w:val="0000CC"/>
-                <w:sz w:val="24"/>
-                <w:szCs w:val="24"/>
-              </w:rPr>
-              <w:t>&gt;</w:t>
-            </w:r>
-          </w:p>
-          <w:p>
-            <w:pPr>
-              <w:pStyle w:val="NoSpacing"/>
-              <w:spacing w:line="276" w:lineRule="auto"/>
-              <w:rPr>
-                <w:rFonts w:asciiTheme="majorHAnsi" w:hAnsiTheme="majorHAnsi"/>
-                <w:color w:val="0000CC"/>
-                <w:sz w:val="24"/>
-                <w:szCs w:val="24"/>
-              </w:rPr>
-            </w:pPr>
-            <w:r>
-              <w:rPr>
-                <w:rFonts w:asciiTheme="majorHAnsi" w:hAnsiTheme="majorHAnsi"/>
-                <w:color w:val="0000CC"/>
-                <w:sz w:val="24"/>
-                <w:szCs w:val="24"/>
-              </w:rPr>
-              <w:t xml:space="preserve">&lt;pear, </w:t>
-            </w:r>
-            <w:r>
-              <w:rPr>
-                <w:rFonts w:asciiTheme="majorHAnsi" w:hAnsiTheme="majorHAnsi"/>
-                <w:color w:val="0000CC"/>
-                <w:sz w:val="24"/>
-                <w:szCs w:val="24"/>
-              </w:rPr>
-              <w:t>1</w:t>
-            </w:r>
-            <w:r>
-              <w:rPr>
-                <w:rFonts w:asciiTheme="majorHAnsi" w:hAnsiTheme="majorHAnsi"/>
-                <w:color w:val="0000CC"/>
-                <w:sz w:val="24"/>
-                <w:szCs w:val="24"/>
-              </w:rPr>
-              <w:t>&gt;</w:t>
-            </w:r>
-          </w:p>
-          <w:p>
-            <w:pPr>
-              <w:pStyle w:val="NoSpacing"/>
-              <w:spacing w:line="276" w:lineRule="auto"/>
-              <w:rPr>
-                <w:rFonts w:asciiTheme="majorHAnsi" w:hAnsiTheme="majorHAnsi"/>
-                <w:color w:val="0000CC"/>
-                <w:sz w:val="24"/>
-                <w:szCs w:val="24"/>
-              </w:rPr>
-            </w:pPr>
-            <w:r>
-              <w:rPr>
-                <w:rFonts w:asciiTheme="majorHAnsi" w:hAnsiTheme="majorHAnsi"/>
-                <w:color w:val="0000CC"/>
-                <w:sz w:val="24"/>
-                <w:szCs w:val="24"/>
-              </w:rPr>
-              <w:t xml:space="preserve">&lt;plum, </w:t>
-            </w:r>
-            <w:r>
-              <w:rPr>
-                <w:rFonts w:asciiTheme="majorHAnsi" w:hAnsiTheme="majorHAnsi"/>
-                <w:color w:val="0000CC"/>
-                <w:sz w:val="24"/>
-                <w:szCs w:val="24"/>
-              </w:rPr>
-              <w:t>1</w:t>
-            </w:r>
-            <w:r>
-              <w:rPr>
-                <w:rFonts w:asciiTheme="majorHAnsi" w:hAnsiTheme="majorHAnsi"/>
-                <w:color w:val="0000CC"/>
-                <w:sz w:val="24"/>
-                <w:szCs w:val="24"/>
-              </w:rPr>
-              <w:t>&gt;</w:t>
-            </w:r>
-          </w:p>
-          <w:p>
-            <w:pPr>
-              <w:pStyle w:val="NoSpacing"/>
-              <w:spacing w:line="276" w:lineRule="auto"/>
-              <w:rPr>
-                <w:rFonts w:asciiTheme="majorHAnsi" w:hAnsiTheme="majorHAnsi"/>
-                <w:color w:val="0000CC"/>
-                <w:sz w:val="24"/>
-                <w:szCs w:val="24"/>
-              </w:rPr>
-            </w:pPr>
-            <w:r>
-              <w:rPr>
-                <w:rFonts w:asciiTheme="majorHAnsi" w:hAnsiTheme="majorHAnsi"/>
-                <w:color w:val="0000CC"/>
-                <w:sz w:val="24"/>
-                <w:szCs w:val="24"/>
-              </w:rPr>
-              <w:t xml:space="preserve">&lt;radish, </w:t>
-            </w:r>
-            <w:r>
-              <w:rPr>
-                <w:rFonts w:asciiTheme="majorHAnsi" w:hAnsiTheme="majorHAnsi"/>
-                <w:color w:val="0000CC"/>
-                <w:sz w:val="24"/>
-                <w:szCs w:val="24"/>
-              </w:rPr>
-              <w:t>2</w:t>
-            </w:r>
-            <w:r>
-              <w:rPr>
-                <w:rFonts w:asciiTheme="majorHAnsi" w:hAnsiTheme="majorHAnsi"/>
-                <w:color w:val="0000CC"/>
-                <w:sz w:val="24"/>
-                <w:szCs w:val="24"/>
-              </w:rPr>
-              <w:t>&gt;</w:t>
+              <w:t>&lt;banana, 3&gt;</w:t>
+            </w:r>
+          </w:p>
+          <w:p>
+            <w:pPr>
+              <w:pStyle w:val="NoSpacing"/>
+              <w:spacing w:line="276" w:lineRule="auto"/>
+              <w:rPr>
+                <w:rFonts w:asciiTheme="majorHAnsi" w:hAnsiTheme="majorHAnsi"/>
+                <w:color w:val="0000CC"/>
+                <w:sz w:val="24"/>
+                <w:szCs w:val="24"/>
+              </w:rPr>
+            </w:pPr>
+            <w:r>
+              <w:rPr>
+                <w:rFonts w:asciiTheme="majorHAnsi" w:hAnsiTheme="majorHAnsi"/>
+                <w:color w:val="0000CC"/>
+                <w:sz w:val="24"/>
+                <w:szCs w:val="24"/>
+              </w:rPr>
+              <w:t>&lt;carrot, 1&gt;</w:t>
+            </w:r>
+          </w:p>
+          <w:p>
+            <w:pPr>
+              <w:pStyle w:val="NoSpacing"/>
+              <w:spacing w:line="276" w:lineRule="auto"/>
+              <w:rPr>
+                <w:rFonts w:asciiTheme="majorHAnsi" w:hAnsiTheme="majorHAnsi"/>
+                <w:color w:val="0000CC"/>
+                <w:sz w:val="24"/>
+                <w:szCs w:val="24"/>
+              </w:rPr>
+            </w:pPr>
+            <w:r>
+              <w:rPr>
+                <w:rFonts w:asciiTheme="majorHAnsi" w:hAnsiTheme="majorHAnsi"/>
+                <w:color w:val="0000CC"/>
+                <w:sz w:val="24"/>
+                <w:szCs w:val="24"/>
+              </w:rPr>
+              <w:t>&lt;cherry, 6&gt;</w:t>
+            </w:r>
+          </w:p>
+          <w:p>
+            <w:pPr>
+              <w:pStyle w:val="NoSpacing"/>
+              <w:spacing w:line="276" w:lineRule="auto"/>
+              <w:rPr>
+                <w:rFonts w:asciiTheme="majorHAnsi" w:hAnsiTheme="majorHAnsi"/>
+                <w:color w:val="0000CC"/>
+                <w:sz w:val="24"/>
+                <w:szCs w:val="24"/>
+              </w:rPr>
+            </w:pPr>
+            <w:r>
+              <w:rPr>
+                <w:rFonts w:asciiTheme="majorHAnsi" w:hAnsiTheme="majorHAnsi"/>
+                <w:color w:val="0000CC"/>
+                <w:sz w:val="24"/>
+                <w:szCs w:val="24"/>
+              </w:rPr>
+              <w:t>&lt;mango, 2&gt;</w:t>
+            </w:r>
+          </w:p>
+          <w:p>
+            <w:pPr>
+              <w:pStyle w:val="NoSpacing"/>
+              <w:spacing w:line="276" w:lineRule="auto"/>
+              <w:rPr>
+                <w:rFonts w:asciiTheme="majorHAnsi" w:hAnsiTheme="majorHAnsi"/>
+                <w:color w:val="0000CC"/>
+                <w:sz w:val="24"/>
+                <w:szCs w:val="24"/>
+              </w:rPr>
+            </w:pPr>
+            <w:r>
+              <w:rPr>
+                <w:rFonts w:asciiTheme="majorHAnsi" w:hAnsiTheme="majorHAnsi"/>
+                <w:color w:val="0000CC"/>
+                <w:sz w:val="24"/>
+                <w:szCs w:val="24"/>
+              </w:rPr>
+              <w:t>&lt;pear, 1&gt;</w:t>
+            </w:r>
+          </w:p>
+          <w:p>
+            <w:pPr>
+              <w:pStyle w:val="NoSpacing"/>
+              <w:spacing w:line="276" w:lineRule="auto"/>
+              <w:rPr>
+                <w:rFonts w:asciiTheme="majorHAnsi" w:hAnsiTheme="majorHAnsi"/>
+                <w:color w:val="0000CC"/>
+                <w:sz w:val="24"/>
+                <w:szCs w:val="24"/>
+              </w:rPr>
+            </w:pPr>
+            <w:r>
+              <w:rPr>
+                <w:rFonts w:asciiTheme="majorHAnsi" w:hAnsiTheme="majorHAnsi"/>
+                <w:color w:val="0000CC"/>
+                <w:sz w:val="24"/>
+                <w:szCs w:val="24"/>
+              </w:rPr>
+              <w:t>&lt;plum, 1&gt;</w:t>
+            </w:r>
+          </w:p>
+          <w:p>
+            <w:pPr>
+              <w:pStyle w:val="NoSpacing"/>
+              <w:spacing w:line="276" w:lineRule="auto"/>
+              <w:rPr>
+                <w:rFonts w:asciiTheme="majorHAnsi" w:hAnsiTheme="majorHAnsi"/>
+                <w:color w:val="0000CC"/>
+                <w:sz w:val="24"/>
+                <w:szCs w:val="24"/>
+              </w:rPr>
+            </w:pPr>
+            <w:r>
+              <w:rPr>
+                <w:rFonts w:asciiTheme="majorHAnsi" w:hAnsiTheme="majorHAnsi"/>
+                <w:color w:val="0000CC"/>
+                <w:sz w:val="24"/>
+                <w:szCs w:val="24"/>
+              </w:rPr>
+              <w:t>&lt;radish, 2&gt;</w:t>
             </w:r>
           </w:p>
           <w:p>

</xml_diff>